<commit_message>
tirando pontos que não estão na abnt
</commit_message>
<xml_diff>
--- a/ABNT - TCC (1).docx
+++ b/ABNT - TCC (1).docx
@@ -1,6 +1,6 @@
 
 <file path=word/document.xml><?xml version="1.0" encoding="utf-8"?>
-<w:document xmlns:wpc="http://schemas.microsoft.com/office/word/2010/wordprocessingCanvas" xmlns:cx="http://schemas.microsoft.com/office/drawing/2014/chartex" xmlns:cx1="http://schemas.microsoft.com/office/drawing/2015/9/8/chartex" xmlns:cx2="http://schemas.microsoft.com/office/drawing/2015/10/21/chartex" xmlns:cx3="http://schemas.microsoft.com/office/drawing/2016/5/9/chartex" xmlns:cx4="http://schemas.microsoft.com/office/drawing/2016/5/10/chartex" xmlns:cx5="http://schemas.microsoft.com/office/drawing/2016/5/11/chartex" xmlns:cx6="http://schemas.microsoft.com/office/drawing/2016/5/12/chartex" xmlns:cx7="http://schemas.microsoft.com/office/drawing/2016/5/13/chartex" xmlns:cx8="http://schemas.microsoft.com/office/drawing/2016/5/14/chartex" xmlns:mc="http://schemas.openxmlformats.org/markup-compatibility/2006" xmlns:aink="http://schemas.microsoft.com/office/drawing/2016/ink" xmlns:am3d="http://schemas.microsoft.com/office/drawing/2017/model3d" xmlns:o="urn:schemas-microsoft-com:office:office" xmlns:oel="http://schemas.microsoft.com/office/2019/extlst" xmlns:r="http://schemas.openxmlformats.org/officeDocument/2006/relationships" xmlns:m="http://schemas.openxmlformats.org/officeDocument/2006/math" xmlns:v="urn:schemas-microsoft-com:vml" xmlns:wp14="http://schemas.microsoft.com/office/word/2010/wordprocessingDrawing" xmlns:wp="http://schemas.openxmlformats.org/drawingml/2006/wordprocessingDrawing" xmlns:w10="urn:schemas-microsoft-com:office:word" xmlns:w="http://schemas.openxmlformats.org/wordprocessingml/2006/main" xmlns:w14="http://schemas.microsoft.com/office/word/2010/wordml" xmlns:w15="http://schemas.microsoft.com/office/word/2012/wordml" xmlns:w16cex="http://schemas.microsoft.com/office/word/2018/wordml/cex" xmlns:w16cid="http://schemas.microsoft.com/office/word/2016/wordml/cid" xmlns:w16="http://schemas.microsoft.com/office/word/2018/wordml" xmlns:w16du="http://schemas.microsoft.com/office/word/2023/wordml/word16du" xmlns:w16sdtdh="http://schemas.microsoft.com/office/word/2020/wordml/sdtdatahash" xmlns:w16sdtfl="http://schemas.microsoft.com/office/word/2024/wordml/sdtformatlock" xmlns:w16se="http://schemas.microsoft.com/office/word/2015/wordml/symex" xmlns:wpg="http://schemas.microsoft.com/office/word/2010/wordprocessingGroup" xmlns:wpi="http://schemas.microsoft.com/office/word/2010/wordprocessingInk" xmlns:wne="http://schemas.microsoft.com/office/word/2006/wordml" xmlns:wps="http://schemas.microsoft.com/office/word/2010/wordprocessingShape" mc:Ignorable="w14 w15 w16se w16cid w16 w16cex w16sdtdh w16sdtfl w16du wp14">
+<w:document xmlns:wpc="http://schemas.microsoft.com/office/word/2010/wordprocessingCanvas" xmlns:cx="http://schemas.microsoft.com/office/drawing/2014/chartex" xmlns:cx1="http://schemas.microsoft.com/office/drawing/2015/9/8/chartex" xmlns:cx2="http://schemas.microsoft.com/office/drawing/2015/10/21/chartex" xmlns:cx3="http://schemas.microsoft.com/office/drawing/2016/5/9/chartex" xmlns:cx4="http://schemas.microsoft.com/office/drawing/2016/5/10/chartex" xmlns:cx5="http://schemas.microsoft.com/office/drawing/2016/5/11/chartex" xmlns:cx6="http://schemas.microsoft.com/office/drawing/2016/5/12/chartex" xmlns:cx7="http://schemas.microsoft.com/office/drawing/2016/5/13/chartex" xmlns:cx8="http://schemas.microsoft.com/office/drawing/2016/5/14/chartex" xmlns:mc="http://schemas.openxmlformats.org/markup-compatibility/2006" xmlns:aink="http://schemas.microsoft.com/office/drawing/2016/ink" xmlns:am3d="http://schemas.microsoft.com/office/drawing/2017/model3d" xmlns:o="urn:schemas-microsoft-com:office:office" xmlns:r="http://schemas.openxmlformats.org/officeDocument/2006/relationships" xmlns:m="http://schemas.openxmlformats.org/officeDocument/2006/math" xmlns:v="urn:schemas-microsoft-com:vml" xmlns:wp14="http://schemas.microsoft.com/office/word/2010/wordprocessingDrawing" xmlns:wp="http://schemas.openxmlformats.org/drawingml/2006/wordprocessingDrawing" xmlns:w10="urn:schemas-microsoft-com:office:word" xmlns:w="http://schemas.openxmlformats.org/wordprocessingml/2006/main" xmlns:w14="http://schemas.microsoft.com/office/word/2010/wordml" xmlns:w15="http://schemas.microsoft.com/office/word/2012/wordml" xmlns:w16cid="http://schemas.microsoft.com/office/word/2016/wordml/cid" xmlns:w16se="http://schemas.microsoft.com/office/word/2015/wordml/symex" xmlns:wpg="http://schemas.microsoft.com/office/word/2010/wordprocessingGroup" xmlns:wpi="http://schemas.microsoft.com/office/word/2010/wordprocessingInk" xmlns:wne="http://schemas.microsoft.com/office/word/2006/wordml" xmlns:wps="http://schemas.microsoft.com/office/word/2010/wordprocessingShape" mc:Ignorable="w14 w15 w16se w16cid wp14">
   <w:body>
     <w:p>
       <w:pPr>
@@ -113,14 +113,25 @@
           <w:szCs w:val="28"/>
         </w:rPr>
       </w:pPr>
-      <w:r>
-        <w:rPr>
-          <w:rFonts w:cs="Times New Roman"/>
-          <w:b/>
-          <w:sz w:val="28"/>
-          <w:szCs w:val="28"/>
-        </w:rPr>
-        <w:t>Gabrielli Helena da Silva</w:t>
+      <w:proofErr w:type="spellStart"/>
+      <w:r>
+        <w:rPr>
+          <w:rFonts w:cs="Times New Roman"/>
+          <w:b/>
+          <w:sz w:val="28"/>
+          <w:szCs w:val="28"/>
+        </w:rPr>
+        <w:t>Gabrielli</w:t>
+      </w:r>
+      <w:proofErr w:type="spellEnd"/>
+      <w:r>
+        <w:rPr>
+          <w:rFonts w:cs="Times New Roman"/>
+          <w:b/>
+          <w:sz w:val="28"/>
+          <w:szCs w:val="28"/>
+        </w:rPr>
+        <w:t xml:space="preserve"> Helena da Silva</w:t>
       </w:r>
     </w:p>
     <w:p>
@@ -428,14 +439,25 @@
           <w:szCs w:val="28"/>
         </w:rPr>
       </w:pPr>
-      <w:r>
-        <w:rPr>
-          <w:rFonts w:cs="Times New Roman"/>
-          <w:b/>
-          <w:sz w:val="28"/>
-          <w:szCs w:val="28"/>
-        </w:rPr>
-        <w:t>Gabrielli Helena da Silva</w:t>
+      <w:proofErr w:type="spellStart"/>
+      <w:r>
+        <w:rPr>
+          <w:rFonts w:cs="Times New Roman"/>
+          <w:b/>
+          <w:sz w:val="28"/>
+          <w:szCs w:val="28"/>
+        </w:rPr>
+        <w:t>Gabrielli</w:t>
+      </w:r>
+      <w:proofErr w:type="spellEnd"/>
+      <w:r>
+        <w:rPr>
+          <w:rFonts w:cs="Times New Roman"/>
+          <w:b/>
+          <w:sz w:val="28"/>
+          <w:szCs w:val="28"/>
+        </w:rPr>
+        <w:t xml:space="preserve"> Helena da Silva</w:t>
       </w:r>
     </w:p>
     <w:p>
@@ -654,6 +676,7 @@
         </w:rPr>
         <w:t xml:space="preserve"> </w:t>
       </w:r>
+      <w:proofErr w:type="spellStart"/>
       <w:r>
         <w:rPr>
           <w:rFonts w:cs="Times New Roman"/>
@@ -668,7 +691,34 @@
           <w:b/>
           <w:bCs/>
         </w:rPr>
-        <w:t>rof° Alexandre Zordan Durães</w:t>
+        <w:t>rof°</w:t>
+      </w:r>
+      <w:proofErr w:type="spellEnd"/>
+      <w:r>
+        <w:rPr>
+          <w:rFonts w:cs="Times New Roman"/>
+          <w:b/>
+          <w:bCs/>
+        </w:rPr>
+        <w:t xml:space="preserve"> Alexandre </w:t>
+      </w:r>
+      <w:proofErr w:type="spellStart"/>
+      <w:r>
+        <w:rPr>
+          <w:rFonts w:cs="Times New Roman"/>
+          <w:b/>
+          <w:bCs/>
+        </w:rPr>
+        <w:t>Zordan</w:t>
+      </w:r>
+      <w:proofErr w:type="spellEnd"/>
+      <w:r>
+        <w:rPr>
+          <w:rFonts w:cs="Times New Roman"/>
+          <w:b/>
+          <w:bCs/>
+        </w:rPr>
+        <w:t xml:space="preserve"> Durães</w:t>
       </w:r>
       <w:r>
         <w:rPr>
@@ -1012,6 +1062,7 @@
           <w:id w:val="1299027282"/>
           <w:citation/>
         </w:sdtPr>
+        <w:sdtEndPr/>
         <w:sdtContent>
           <w:r>
             <w:fldChar w:fldCharType="begin"/>
@@ -1049,6 +1100,7 @@
           <w:id w:val="-802998022"/>
           <w:citation/>
         </w:sdtPr>
+        <w:sdtEndPr/>
         <w:sdtContent>
           <w:r>
             <w:fldChar w:fldCharType="begin"/>
@@ -1073,7 +1125,15 @@
     </w:p>
     <w:p>
       <w:r>
-        <w:t xml:space="preserve">Ambos os cenários geram podem ser controlados no começo da empresa, principalmente do gerenciamento, utilizando de matérias simples como pranchetas ou até mesmo a memória para reabastecer estoque ou controlar prazos, mas a medida que o negócio cresce, depender de recursos tão manuais se torna inviável, </w:t>
+        <w:t xml:space="preserve">Ambos os cenários geram podem ser controlados no começo da empresa, principalmente do gerenciamento, utilizando de matérias simples como pranchetas ou até mesmo a memória para reabastecer estoque ou controlar prazos, mas </w:t>
+      </w:r>
+      <w:proofErr w:type="spellStart"/>
+      <w:r>
+        <w:t>a</w:t>
+      </w:r>
+      <w:proofErr w:type="spellEnd"/>
+      <w:r>
+        <w:t xml:space="preserve"> medida que o negócio cresce, depender de recursos tão manuais se torna inviável, </w:t>
       </w:r>
       <w:r>
         <w:t>gerando erros por necessitar sempre de atualização e atenção, cansando o colaborador — normalmente — alguém mais alto como o gestor, fora disso, a falta de confiança do mesmo para outros colaboradores executar essas tarefas pode gerar retrabalho e perca de tempo, podendo ter sido melhor aproveitada pensando na experiência do cliente.</w:t>
@@ -1083,6 +1143,7 @@
           <w:id w:val="-609969738"/>
           <w:citation/>
         </w:sdtPr>
+        <w:sdtEndPr/>
         <w:sdtContent>
           <w:r>
             <w:fldChar w:fldCharType="begin"/>
@@ -1117,6 +1178,7 @@
           <w:id w:val="-1449926825"/>
           <w:citation/>
         </w:sdtPr>
+        <w:sdtEndPr/>
         <w:sdtContent>
           <w:r>
             <w:fldChar w:fldCharType="begin"/>
@@ -1148,7 +1210,15 @@
       </w:r>
       <w:r>
         <w:lastRenderedPageBreak/>
-        <w:t>pois segundo pesquisas da equipe da Empresa Júnior Fundação Getúlio Vargas, aproximadamente 60% das microempresas fecham as portas antes mesmo de completarem meia década, por conta de imprevistos evitáveis se tomado a devida medida preventiva. Dido isso, a melhor prevenção encontrada pelas grandes empresas foi a implementação de algum tipo de organização como a utilização de sistemas.</w:t>
+        <w:t xml:space="preserve">pois segundo pesquisas da equipe da Empresa Júnior Fundação Getúlio Vargas, aproximadamente 60% das microempresas fecham as portas antes mesmo de completarem meia década, por conta de imprevistos evitáveis se tomado a devida medida preventiva. </w:t>
+      </w:r>
+      <w:proofErr w:type="spellStart"/>
+      <w:r>
+        <w:t>Dido</w:t>
+      </w:r>
+      <w:proofErr w:type="spellEnd"/>
+      <w:r>
+        <w:t xml:space="preserve"> isso, a melhor prevenção encontrada pelas grandes empresas foi a implementação de algum tipo de organização como a utilização de sistemas.</w:t>
       </w:r>
     </w:p>
     <w:p>
@@ -1413,8 +1483,16 @@
         <w:rPr>
           <w:highlight w:val="green"/>
         </w:rPr>
-        <w:t>Delimitação Escolpo</w:t>
-      </w:r>
+        <w:t xml:space="preserve">Delimitação </w:t>
+      </w:r>
+      <w:proofErr w:type="spellStart"/>
+      <w:r>
+        <w:rPr>
+          <w:highlight w:val="green"/>
+        </w:rPr>
+        <w:t>Escolpo</w:t>
+      </w:r>
+      <w:proofErr w:type="spellEnd"/>
     </w:p>
     <w:p>
       <w:pPr>
@@ -1483,11 +1561,19 @@
           <w:highlight w:val="yellow"/>
         </w:rPr>
       </w:pPr>
+      <w:proofErr w:type="spellStart"/>
       <w:r>
         <w:rPr>
           <w:highlight w:val="yellow"/>
         </w:rPr>
-        <w:t>Elicitação e levantamento de requisitos</w:t>
+        <w:t>Elicitação</w:t>
+      </w:r>
+      <w:proofErr w:type="spellEnd"/>
+      <w:r>
+        <w:rPr>
+          <w:highlight w:val="yellow"/>
+        </w:rPr>
+        <w:t xml:space="preserve"> e levantamento de requisitos</w:t>
       </w:r>
     </w:p>
     <w:p>
@@ -1950,7 +2036,15 @@
     <w:p>
       <w:pPr>
         <w:ind w:hanging="11"/>
-      </w:pPr>
+        <w:rPr>
+          <w:u w:val="single"/>
+        </w:rPr>
+      </w:pPr>
+      <w:r>
+        <w:t>teste</w:t>
+      </w:r>
+      <w:bookmarkStart w:id="0" w:name="_GoBack"/>
+      <w:bookmarkEnd w:id="0"/>
     </w:p>
     <w:sectPr>
       <w:pgSz w:w="11906" w:h="16838"/>
@@ -1963,7 +2057,7 @@
 </file>
 
 <file path=word/endnotes.xml><?xml version="1.0" encoding="utf-8"?>
-<w:endnotes xmlns:wpc="http://schemas.microsoft.com/office/word/2010/wordprocessingCanvas" xmlns:cx="http://schemas.microsoft.com/office/drawing/2014/chartex" xmlns:cx1="http://schemas.microsoft.com/office/drawing/2015/9/8/chartex" xmlns:cx2="http://schemas.microsoft.com/office/drawing/2015/10/21/chartex" xmlns:cx3="http://schemas.microsoft.com/office/drawing/2016/5/9/chartex" xmlns:cx4="http://schemas.microsoft.com/office/drawing/2016/5/10/chartex" xmlns:cx5="http://schemas.microsoft.com/office/drawing/2016/5/11/chartex" xmlns:cx6="http://schemas.microsoft.com/office/drawing/2016/5/12/chartex" xmlns:cx7="http://schemas.microsoft.com/office/drawing/2016/5/13/chartex" xmlns:cx8="http://schemas.microsoft.com/office/drawing/2016/5/14/chartex" xmlns:mc="http://schemas.openxmlformats.org/markup-compatibility/2006" xmlns:aink="http://schemas.microsoft.com/office/drawing/2016/ink" xmlns:am3d="http://schemas.microsoft.com/office/drawing/2017/model3d" xmlns:o="urn:schemas-microsoft-com:office:office" xmlns:oel="http://schemas.microsoft.com/office/2019/extlst" xmlns:r="http://schemas.openxmlformats.org/officeDocument/2006/relationships" xmlns:m="http://schemas.openxmlformats.org/officeDocument/2006/math" xmlns:v="urn:schemas-microsoft-com:vml" xmlns:wp14="http://schemas.microsoft.com/office/word/2010/wordprocessingDrawing" xmlns:wp="http://schemas.openxmlformats.org/drawingml/2006/wordprocessingDrawing" xmlns:w10="urn:schemas-microsoft-com:office:word" xmlns:w="http://schemas.openxmlformats.org/wordprocessingml/2006/main" xmlns:w14="http://schemas.microsoft.com/office/word/2010/wordml" xmlns:w15="http://schemas.microsoft.com/office/word/2012/wordml" xmlns:w16cex="http://schemas.microsoft.com/office/word/2018/wordml/cex" xmlns:w16cid="http://schemas.microsoft.com/office/word/2016/wordml/cid" xmlns:w16="http://schemas.microsoft.com/office/word/2018/wordml" xmlns:w16du="http://schemas.microsoft.com/office/word/2023/wordml/word16du" xmlns:w16sdtdh="http://schemas.microsoft.com/office/word/2020/wordml/sdtdatahash" xmlns:w16sdtfl="http://schemas.microsoft.com/office/word/2024/wordml/sdtformatlock" xmlns:w16se="http://schemas.microsoft.com/office/word/2015/wordml/symex" xmlns:wpg="http://schemas.microsoft.com/office/word/2010/wordprocessingGroup" xmlns:wpi="http://schemas.microsoft.com/office/word/2010/wordprocessingInk" xmlns:wne="http://schemas.microsoft.com/office/word/2006/wordml" xmlns:wps="http://schemas.microsoft.com/office/word/2010/wordprocessingShape" mc:Ignorable="w14 w15 w16se w16cid w16 w16cex w16sdtdh w16sdtfl w16du wp14">
+<w:endnotes xmlns:wpc="http://schemas.microsoft.com/office/word/2010/wordprocessingCanvas" xmlns:cx="http://schemas.microsoft.com/office/drawing/2014/chartex" xmlns:cx1="http://schemas.microsoft.com/office/drawing/2015/9/8/chartex" xmlns:cx2="http://schemas.microsoft.com/office/drawing/2015/10/21/chartex" xmlns:cx3="http://schemas.microsoft.com/office/drawing/2016/5/9/chartex" xmlns:cx4="http://schemas.microsoft.com/office/drawing/2016/5/10/chartex" xmlns:cx5="http://schemas.microsoft.com/office/drawing/2016/5/11/chartex" xmlns:cx6="http://schemas.microsoft.com/office/drawing/2016/5/12/chartex" xmlns:cx7="http://schemas.microsoft.com/office/drawing/2016/5/13/chartex" xmlns:cx8="http://schemas.microsoft.com/office/drawing/2016/5/14/chartex" xmlns:mc="http://schemas.openxmlformats.org/markup-compatibility/2006" xmlns:aink="http://schemas.microsoft.com/office/drawing/2016/ink" xmlns:am3d="http://schemas.microsoft.com/office/drawing/2017/model3d" xmlns:o="urn:schemas-microsoft-com:office:office" xmlns:r="http://schemas.openxmlformats.org/officeDocument/2006/relationships" xmlns:m="http://schemas.openxmlformats.org/officeDocument/2006/math" xmlns:v="urn:schemas-microsoft-com:vml" xmlns:wp14="http://schemas.microsoft.com/office/word/2010/wordprocessingDrawing" xmlns:wp="http://schemas.openxmlformats.org/drawingml/2006/wordprocessingDrawing" xmlns:w10="urn:schemas-microsoft-com:office:word" xmlns:w="http://schemas.openxmlformats.org/wordprocessingml/2006/main" xmlns:w14="http://schemas.microsoft.com/office/word/2010/wordml" xmlns:w15="http://schemas.microsoft.com/office/word/2012/wordml" xmlns:w16cid="http://schemas.microsoft.com/office/word/2016/wordml/cid" xmlns:w16se="http://schemas.microsoft.com/office/word/2015/wordml/symex" xmlns:wpg="http://schemas.microsoft.com/office/word/2010/wordprocessingGroup" xmlns:wpi="http://schemas.microsoft.com/office/word/2010/wordprocessingInk" xmlns:wne="http://schemas.microsoft.com/office/word/2006/wordml" xmlns:wps="http://schemas.microsoft.com/office/word/2010/wordprocessingShape" mc:Ignorable="w14 w15 w16se w16cid wp14">
   <w:endnote w:type="separator" w:id="-1">
     <w:p>
       <w:pPr>
@@ -1988,7 +2082,7 @@
 </file>
 
 <file path=word/footnotes.xml><?xml version="1.0" encoding="utf-8"?>
-<w:footnotes xmlns:wpc="http://schemas.microsoft.com/office/word/2010/wordprocessingCanvas" xmlns:cx="http://schemas.microsoft.com/office/drawing/2014/chartex" xmlns:cx1="http://schemas.microsoft.com/office/drawing/2015/9/8/chartex" xmlns:cx2="http://schemas.microsoft.com/office/drawing/2015/10/21/chartex" xmlns:cx3="http://schemas.microsoft.com/office/drawing/2016/5/9/chartex" xmlns:cx4="http://schemas.microsoft.com/office/drawing/2016/5/10/chartex" xmlns:cx5="http://schemas.microsoft.com/office/drawing/2016/5/11/chartex" xmlns:cx6="http://schemas.microsoft.com/office/drawing/2016/5/12/chartex" xmlns:cx7="http://schemas.microsoft.com/office/drawing/2016/5/13/chartex" xmlns:cx8="http://schemas.microsoft.com/office/drawing/2016/5/14/chartex" xmlns:mc="http://schemas.openxmlformats.org/markup-compatibility/2006" xmlns:aink="http://schemas.microsoft.com/office/drawing/2016/ink" xmlns:am3d="http://schemas.microsoft.com/office/drawing/2017/model3d" xmlns:o="urn:schemas-microsoft-com:office:office" xmlns:oel="http://schemas.microsoft.com/office/2019/extlst" xmlns:r="http://schemas.openxmlformats.org/officeDocument/2006/relationships" xmlns:m="http://schemas.openxmlformats.org/officeDocument/2006/math" xmlns:v="urn:schemas-microsoft-com:vml" xmlns:wp14="http://schemas.microsoft.com/office/word/2010/wordprocessingDrawing" xmlns:wp="http://schemas.openxmlformats.org/drawingml/2006/wordprocessingDrawing" xmlns:w10="urn:schemas-microsoft-com:office:word" xmlns:w="http://schemas.openxmlformats.org/wordprocessingml/2006/main" xmlns:w14="http://schemas.microsoft.com/office/word/2010/wordml" xmlns:w15="http://schemas.microsoft.com/office/word/2012/wordml" xmlns:w16cex="http://schemas.microsoft.com/office/word/2018/wordml/cex" xmlns:w16cid="http://schemas.microsoft.com/office/word/2016/wordml/cid" xmlns:w16="http://schemas.microsoft.com/office/word/2018/wordml" xmlns:w16du="http://schemas.microsoft.com/office/word/2023/wordml/word16du" xmlns:w16sdtdh="http://schemas.microsoft.com/office/word/2020/wordml/sdtdatahash" xmlns:w16sdtfl="http://schemas.microsoft.com/office/word/2024/wordml/sdtformatlock" xmlns:w16se="http://schemas.microsoft.com/office/word/2015/wordml/symex" xmlns:wpg="http://schemas.microsoft.com/office/word/2010/wordprocessingGroup" xmlns:wpi="http://schemas.microsoft.com/office/word/2010/wordprocessingInk" xmlns:wne="http://schemas.microsoft.com/office/word/2006/wordml" xmlns:wps="http://schemas.microsoft.com/office/word/2010/wordprocessingShape" mc:Ignorable="w14 w15 w16se w16cid w16 w16cex w16sdtdh w16sdtfl w16du wp14">
+<w:footnotes xmlns:wpc="http://schemas.microsoft.com/office/word/2010/wordprocessingCanvas" xmlns:cx="http://schemas.microsoft.com/office/drawing/2014/chartex" xmlns:cx1="http://schemas.microsoft.com/office/drawing/2015/9/8/chartex" xmlns:cx2="http://schemas.microsoft.com/office/drawing/2015/10/21/chartex" xmlns:cx3="http://schemas.microsoft.com/office/drawing/2016/5/9/chartex" xmlns:cx4="http://schemas.microsoft.com/office/drawing/2016/5/10/chartex" xmlns:cx5="http://schemas.microsoft.com/office/drawing/2016/5/11/chartex" xmlns:cx6="http://schemas.microsoft.com/office/drawing/2016/5/12/chartex" xmlns:cx7="http://schemas.microsoft.com/office/drawing/2016/5/13/chartex" xmlns:cx8="http://schemas.microsoft.com/office/drawing/2016/5/14/chartex" xmlns:mc="http://schemas.openxmlformats.org/markup-compatibility/2006" xmlns:aink="http://schemas.microsoft.com/office/drawing/2016/ink" xmlns:am3d="http://schemas.microsoft.com/office/drawing/2017/model3d" xmlns:o="urn:schemas-microsoft-com:office:office" xmlns:r="http://schemas.openxmlformats.org/officeDocument/2006/relationships" xmlns:m="http://schemas.openxmlformats.org/officeDocument/2006/math" xmlns:v="urn:schemas-microsoft-com:vml" xmlns:wp14="http://schemas.microsoft.com/office/word/2010/wordprocessingDrawing" xmlns:wp="http://schemas.openxmlformats.org/drawingml/2006/wordprocessingDrawing" xmlns:w10="urn:schemas-microsoft-com:office:word" xmlns:w="http://schemas.openxmlformats.org/wordprocessingml/2006/main" xmlns:w14="http://schemas.microsoft.com/office/word/2010/wordml" xmlns:w15="http://schemas.microsoft.com/office/word/2012/wordml" xmlns:w16cid="http://schemas.microsoft.com/office/word/2016/wordml/cid" xmlns:w16se="http://schemas.microsoft.com/office/word/2015/wordml/symex" xmlns:wpg="http://schemas.microsoft.com/office/word/2010/wordprocessingGroup" xmlns:wpi="http://schemas.microsoft.com/office/word/2010/wordprocessingInk" xmlns:wne="http://schemas.microsoft.com/office/word/2006/wordml" xmlns:wps="http://schemas.microsoft.com/office/word/2010/wordprocessingShape" mc:Ignorable="w14 w15 w16se w16cid wp14">
   <w:footnote w:type="separator" w:id="-1">
     <w:p>
       <w:pPr>
@@ -2013,7 +2107,7 @@
 </file>
 
 <file path=word/numbering.xml><?xml version="1.0" encoding="utf-8"?>
-<w:numbering xmlns:wpc="http://schemas.microsoft.com/office/word/2010/wordprocessingCanvas" xmlns:cx="http://schemas.microsoft.com/office/drawing/2014/chartex" xmlns:cx1="http://schemas.microsoft.com/office/drawing/2015/9/8/chartex" xmlns:cx2="http://schemas.microsoft.com/office/drawing/2015/10/21/chartex" xmlns:cx3="http://schemas.microsoft.com/office/drawing/2016/5/9/chartex" xmlns:cx4="http://schemas.microsoft.com/office/drawing/2016/5/10/chartex" xmlns:cx5="http://schemas.microsoft.com/office/drawing/2016/5/11/chartex" xmlns:cx6="http://schemas.microsoft.com/office/drawing/2016/5/12/chartex" xmlns:cx7="http://schemas.microsoft.com/office/drawing/2016/5/13/chartex" xmlns:cx8="http://schemas.microsoft.com/office/drawing/2016/5/14/chartex" xmlns:mc="http://schemas.openxmlformats.org/markup-compatibility/2006" xmlns:aink="http://schemas.microsoft.com/office/drawing/2016/ink" xmlns:am3d="http://schemas.microsoft.com/office/drawing/2017/model3d" xmlns:o="urn:schemas-microsoft-com:office:office" xmlns:oel="http://schemas.microsoft.com/office/2019/extlst" xmlns:r="http://schemas.openxmlformats.org/officeDocument/2006/relationships" xmlns:m="http://schemas.openxmlformats.org/officeDocument/2006/math" xmlns:v="urn:schemas-microsoft-com:vml" xmlns:wp14="http://schemas.microsoft.com/office/word/2010/wordprocessingDrawing" xmlns:wp="http://schemas.openxmlformats.org/drawingml/2006/wordprocessingDrawing" xmlns:w10="urn:schemas-microsoft-com:office:word" xmlns:w="http://schemas.openxmlformats.org/wordprocessingml/2006/main" xmlns:w14="http://schemas.microsoft.com/office/word/2010/wordml" xmlns:w15="http://schemas.microsoft.com/office/word/2012/wordml" xmlns:w16cex="http://schemas.microsoft.com/office/word/2018/wordml/cex" xmlns:w16cid="http://schemas.microsoft.com/office/word/2016/wordml/cid" xmlns:w16="http://schemas.microsoft.com/office/word/2018/wordml" xmlns:w16du="http://schemas.microsoft.com/office/word/2023/wordml/word16du" xmlns:w16sdtdh="http://schemas.microsoft.com/office/word/2020/wordml/sdtdatahash" xmlns:w16sdtfl="http://schemas.microsoft.com/office/word/2024/wordml/sdtformatlock" xmlns:w16se="http://schemas.microsoft.com/office/word/2015/wordml/symex" xmlns:wpg="http://schemas.microsoft.com/office/word/2010/wordprocessingGroup" xmlns:wpi="http://schemas.microsoft.com/office/word/2010/wordprocessingInk" xmlns:wne="http://schemas.microsoft.com/office/word/2006/wordml" xmlns:wps="http://schemas.microsoft.com/office/word/2010/wordprocessingShape" mc:Ignorable="w14 w15 w16se w16cid w16 w16cex w16sdtdh w16sdtfl w16du wp14">
+<w:numbering xmlns:wpc="http://schemas.microsoft.com/office/word/2010/wordprocessingCanvas" xmlns:cx="http://schemas.microsoft.com/office/drawing/2014/chartex" xmlns:cx1="http://schemas.microsoft.com/office/drawing/2015/9/8/chartex" xmlns:cx2="http://schemas.microsoft.com/office/drawing/2015/10/21/chartex" xmlns:cx3="http://schemas.microsoft.com/office/drawing/2016/5/9/chartex" xmlns:cx4="http://schemas.microsoft.com/office/drawing/2016/5/10/chartex" xmlns:cx5="http://schemas.microsoft.com/office/drawing/2016/5/11/chartex" xmlns:cx6="http://schemas.microsoft.com/office/drawing/2016/5/12/chartex" xmlns:cx7="http://schemas.microsoft.com/office/drawing/2016/5/13/chartex" xmlns:cx8="http://schemas.microsoft.com/office/drawing/2016/5/14/chartex" xmlns:mc="http://schemas.openxmlformats.org/markup-compatibility/2006" xmlns:aink="http://schemas.microsoft.com/office/drawing/2016/ink" xmlns:am3d="http://schemas.microsoft.com/office/drawing/2017/model3d" xmlns:o="urn:schemas-microsoft-com:office:office" xmlns:r="http://schemas.openxmlformats.org/officeDocument/2006/relationships" xmlns:m="http://schemas.openxmlformats.org/officeDocument/2006/math" xmlns:v="urn:schemas-microsoft-com:vml" xmlns:wp14="http://schemas.microsoft.com/office/word/2010/wordprocessingDrawing" xmlns:wp="http://schemas.openxmlformats.org/drawingml/2006/wordprocessingDrawing" xmlns:w10="urn:schemas-microsoft-com:office:word" xmlns:w="http://schemas.openxmlformats.org/wordprocessingml/2006/main" xmlns:w14="http://schemas.microsoft.com/office/word/2010/wordml" xmlns:w15="http://schemas.microsoft.com/office/word/2012/wordml" xmlns:w16cid="http://schemas.microsoft.com/office/word/2016/wordml/cid" xmlns:w16se="http://schemas.microsoft.com/office/word/2015/wordml/symex" xmlns:wpg="http://schemas.microsoft.com/office/word/2010/wordprocessingGroup" xmlns:wpi="http://schemas.microsoft.com/office/word/2010/wordprocessingInk" xmlns:wne="http://schemas.microsoft.com/office/word/2006/wordml" xmlns:wps="http://schemas.microsoft.com/office/word/2010/wordprocessingShape" mc:Ignorable="w14 w15 w16se w16cid wp14">
   <w:abstractNum w:abstractNumId="0" w15:restartNumberingAfterBreak="0">
     <w:nsid w:val="047121B7"/>
     <w:multiLevelType w:val="multilevel"/>
@@ -4316,110 +4410,110 @@
       </w:rPr>
     </w:lvl>
   </w:abstractNum>
-  <w:num w:numId="1" w16cid:durableId="1605381327">
+  <w:num w:numId="1">
     <w:abstractNumId w:val="14"/>
   </w:num>
-  <w:num w:numId="2" w16cid:durableId="870917401">
+  <w:num w:numId="2">
     <w:abstractNumId w:val="7"/>
   </w:num>
-  <w:num w:numId="3" w16cid:durableId="1393843520">
+  <w:num w:numId="3">
     <w:abstractNumId w:val="11"/>
   </w:num>
-  <w:num w:numId="4" w16cid:durableId="1426266328">
+  <w:num w:numId="4">
     <w:abstractNumId w:val="18"/>
   </w:num>
-  <w:num w:numId="5" w16cid:durableId="430975430">
+  <w:num w:numId="5">
     <w:abstractNumId w:val="17"/>
   </w:num>
-  <w:num w:numId="6" w16cid:durableId="407920254">
+  <w:num w:numId="6">
     <w:abstractNumId w:val="17"/>
     <w:lvlOverride w:ilvl="0">
       <w:startOverride w:val="1"/>
     </w:lvlOverride>
   </w:num>
-  <w:num w:numId="7" w16cid:durableId="796411301">
+  <w:num w:numId="7">
     <w:abstractNumId w:val="17"/>
   </w:num>
-  <w:num w:numId="8" w16cid:durableId="287854028">
+  <w:num w:numId="8">
     <w:abstractNumId w:val="21"/>
   </w:num>
-  <w:num w:numId="9" w16cid:durableId="39329008">
+  <w:num w:numId="9">
     <w:abstractNumId w:val="15"/>
   </w:num>
-  <w:num w:numId="10" w16cid:durableId="54593115">
+  <w:num w:numId="10">
     <w:abstractNumId w:val="28"/>
   </w:num>
-  <w:num w:numId="11" w16cid:durableId="41828428">
+  <w:num w:numId="11">
     <w:abstractNumId w:val="22"/>
   </w:num>
-  <w:num w:numId="12" w16cid:durableId="842357307">
+  <w:num w:numId="12">
     <w:abstractNumId w:val="16"/>
   </w:num>
-  <w:num w:numId="13" w16cid:durableId="1277759165">
+  <w:num w:numId="13">
     <w:abstractNumId w:val="1"/>
   </w:num>
-  <w:num w:numId="14" w16cid:durableId="573711190">
+  <w:num w:numId="14">
     <w:abstractNumId w:val="20"/>
   </w:num>
-  <w:num w:numId="15" w16cid:durableId="1319189068">
+  <w:num w:numId="15">
     <w:abstractNumId w:val="8"/>
   </w:num>
-  <w:num w:numId="16" w16cid:durableId="322782520">
+  <w:num w:numId="16">
     <w:abstractNumId w:val="12"/>
   </w:num>
-  <w:num w:numId="17" w16cid:durableId="2102606150">
+  <w:num w:numId="17">
     <w:abstractNumId w:val="26"/>
   </w:num>
-  <w:num w:numId="18" w16cid:durableId="180321791">
+  <w:num w:numId="18">
     <w:abstractNumId w:val="23"/>
   </w:num>
-  <w:num w:numId="19" w16cid:durableId="701635442">
+  <w:num w:numId="19">
     <w:abstractNumId w:val="2"/>
   </w:num>
-  <w:num w:numId="20" w16cid:durableId="225990693">
+  <w:num w:numId="20">
     <w:abstractNumId w:val="13"/>
   </w:num>
-  <w:num w:numId="21" w16cid:durableId="102461634">
+  <w:num w:numId="21">
     <w:abstractNumId w:val="0"/>
   </w:num>
-  <w:num w:numId="22" w16cid:durableId="1473015856">
+  <w:num w:numId="22">
     <w:abstractNumId w:val="10"/>
   </w:num>
-  <w:num w:numId="23" w16cid:durableId="1616136262">
+  <w:num w:numId="23">
     <w:abstractNumId w:val="19"/>
   </w:num>
-  <w:num w:numId="24" w16cid:durableId="993608550">
+  <w:num w:numId="24">
     <w:abstractNumId w:val="27"/>
   </w:num>
-  <w:num w:numId="25" w16cid:durableId="543559374">
+  <w:num w:numId="25">
     <w:abstractNumId w:val="5"/>
   </w:num>
-  <w:num w:numId="26" w16cid:durableId="806359114">
+  <w:num w:numId="26">
     <w:abstractNumId w:val="6"/>
   </w:num>
-  <w:num w:numId="27" w16cid:durableId="454762468">
+  <w:num w:numId="27">
     <w:abstractNumId w:val="3"/>
   </w:num>
-  <w:num w:numId="28" w16cid:durableId="2063014634">
+  <w:num w:numId="28">
     <w:abstractNumId w:val="9"/>
   </w:num>
-  <w:num w:numId="29" w16cid:durableId="19549821">
+  <w:num w:numId="29">
     <w:abstractNumId w:val="25"/>
   </w:num>
-  <w:num w:numId="30" w16cid:durableId="2047565168">
+  <w:num w:numId="30">
     <w:abstractNumId w:val="4"/>
   </w:num>
-  <w:num w:numId="31" w16cid:durableId="1696888048">
+  <w:num w:numId="31">
     <w:abstractNumId w:val="29"/>
   </w:num>
-  <w:num w:numId="32" w16cid:durableId="428237018">
+  <w:num w:numId="32">
     <w:abstractNumId w:val="24"/>
   </w:num>
 </w:numbering>
 </file>
 
 <file path=word/styles.xml><?xml version="1.0" encoding="utf-8"?>
-<w:styles xmlns:mc="http://schemas.openxmlformats.org/markup-compatibility/2006" xmlns:r="http://schemas.openxmlformats.org/officeDocument/2006/relationships" xmlns:w="http://schemas.openxmlformats.org/wordprocessingml/2006/main" xmlns:w14="http://schemas.microsoft.com/office/word/2010/wordml" xmlns:w15="http://schemas.microsoft.com/office/word/2012/wordml" xmlns:w16cex="http://schemas.microsoft.com/office/word/2018/wordml/cex" xmlns:w16cid="http://schemas.microsoft.com/office/word/2016/wordml/cid" xmlns:w16="http://schemas.microsoft.com/office/word/2018/wordml" xmlns:w16du="http://schemas.microsoft.com/office/word/2023/wordml/word16du" xmlns:w16sdtdh="http://schemas.microsoft.com/office/word/2020/wordml/sdtdatahash" xmlns:w16sdtfl="http://schemas.microsoft.com/office/word/2024/wordml/sdtformatlock" xmlns:w16se="http://schemas.microsoft.com/office/word/2015/wordml/symex" mc:Ignorable="w14 w15 w16se w16cid w16 w16cex w16sdtdh w16sdtfl w16du">
+<w:styles xmlns:mc="http://schemas.openxmlformats.org/markup-compatibility/2006" xmlns:r="http://schemas.openxmlformats.org/officeDocument/2006/relationships" xmlns:w="http://schemas.openxmlformats.org/wordprocessingml/2006/main" xmlns:w14="http://schemas.microsoft.com/office/word/2010/wordml" xmlns:w15="http://schemas.microsoft.com/office/word/2012/wordml" xmlns:w16cid="http://schemas.microsoft.com/office/word/2016/wordml/cid" xmlns:w16se="http://schemas.microsoft.com/office/word/2015/wordml/symex" mc:Ignorable="w14 w15 w16se w16cid">
   <w:docDefaults>
     <w:rPrDefault>
       <w:rPr>
@@ -4435,7 +4529,7 @@
       </w:pPr>
     </w:pPrDefault>
   </w:docDefaults>
-  <w:latentStyles w:defLockedState="0" w:defUIPriority="99" w:defSemiHidden="0" w:defUnhideWhenUsed="0" w:defQFormat="0" w:count="376">
+  <w:latentStyles w:defLockedState="0" w:defUIPriority="99" w:defSemiHidden="0" w:defUnhideWhenUsed="0" w:defQFormat="0" w:count="375">
     <w:lsdException w:name="Normal" w:uiPriority="0" w:qFormat="1"/>
     <w:lsdException w:name="heading 1" w:uiPriority="9" w:qFormat="1"/>
     <w:lsdException w:name="heading 2" w:semiHidden="1" w:uiPriority="9" w:unhideWhenUsed="1" w:qFormat="1"/>
@@ -4811,7 +4905,6 @@
     <w:lsdException w:name="Smart Hyperlink" w:semiHidden="1" w:unhideWhenUsed="1"/>
     <w:lsdException w:name="Hashtag" w:semiHidden="1" w:unhideWhenUsed="1"/>
     <w:lsdException w:name="Unresolved Mention" w:semiHidden="1" w:unhideWhenUsed="1"/>
-    <w:lsdException w:name="Smart Link" w:semiHidden="1" w:unhideWhenUsed="1"/>
   </w:latentStyles>
   <w:style w:type="paragraph" w:default="1" w:styleId="Normal">
     <w:name w:val="Normal"/>
@@ -5651,7 +5744,7 @@
 </file>
 
 <file path=customXml/itemProps1.xml><?xml version="1.0" encoding="utf-8"?>
-<ds:datastoreItem xmlns:ds="http://schemas.openxmlformats.org/officeDocument/2006/customXml" ds:itemID="{FF373A5F-90AB-406E-A513-B8BDD8C0CFAD}">
+<ds:datastoreItem xmlns:ds="http://schemas.openxmlformats.org/officeDocument/2006/customXml" ds:itemID="{59D070D4-C778-43BD-9F52-AA84371F7169}">
   <ds:schemaRefs>
     <ds:schemaRef ds:uri="http://schemas.openxmlformats.org/officeDocument/2006/bibliography"/>
   </ds:schemaRefs>

</xml_diff>